<commit_message>
Save final report progress
</commit_message>
<xml_diff>
--- a/Capstone Project Docs/Washington County Community Needs and Nonprofit Support Gap Analysis.docx
+++ b/Capstone Project Docs/Washington County Community Needs and Nonprofit Support Gap Analysis.docx
@@ -268,7 +268,7 @@
     </w:p>
     <w:p>
       <w:r>
-        <w:t xml:space="preserve">This data set contains public IRS data on </w:t>
+        <w:t xml:space="preserve">This dataset contains public IRS data on </w:t>
       </w:r>
       <w:r>
         <w:t>tax-exempt organizations and their IRS filing and Status</w:t>
@@ -388,7 +388,7 @@
     </w:p>
     <w:p>
       <w:r>
-        <w:t xml:space="preserve">This data set contains </w:t>
+        <w:t xml:space="preserve">This dataset contains </w:t>
       </w:r>
       <w:r>
         <w:t xml:space="preserve">Census data for Washington State; </w:t>
@@ -441,7 +441,7 @@
         <w:t>redundant</w:t>
       </w:r>
       <w:r>
-        <w:t xml:space="preserve"> information. The data was organized at the county level and contained the variables needed to calculate the community-need measure.  There are 39 counties included in the data set and used in the final analysis. I also noticed that the dataset included estimates and error rates rather than raw data. Population, poverty, unemployment</w:t>
+        <w:t xml:space="preserve"> information. The data was organized at the county level and contained the variables needed to calculate the community-need measure.  There are 39 counties included in the dataset and used in the final analysis. I also noticed that the dataset included estimates and error rates rather than raw data. Population, poverty, unemployment</w:t>
       </w:r>
       <w:r>
         <w:t>, and education values were closely examined to ensure that the key features were</w:t>
@@ -488,10 +488,7 @@
         </w:numPr>
       </w:pPr>
       <w:r>
-        <w:t>S1701_C01_001E</w:t>
-      </w:r>
-      <w:r>
-        <w:t xml:space="preserve">- The estimated number of people within the county &amp; from whom poverty status is determined </w:t>
+        <w:t xml:space="preserve">S1701_C01_001E- The estimated number of people within the county &amp; from whom poverty status is determined </w:t>
       </w:r>
     </w:p>
     <w:p>
@@ -503,10 +500,7 @@
         </w:numPr>
       </w:pPr>
       <w:r>
-        <w:t>S1701_C01_023E</w:t>
-      </w:r>
-      <w:r>
-        <w:t xml:space="preserve">- The estimated number of people age 25 and older with less than a high school education </w:t>
+        <w:t xml:space="preserve">S1701_C01_023E- The estimated number of people age 25 and older with less than a high school education </w:t>
       </w:r>
     </w:p>
     <w:p>
@@ -518,10 +512,7 @@
         </w:numPr>
       </w:pPr>
       <w:r>
-        <w:t>S1701_C01_031E</w:t>
-      </w:r>
-      <w:r>
-        <w:t xml:space="preserve">- The estimated number of people 16 and over who are unemployed </w:t>
+        <w:t xml:space="preserve">S1701_C01_031E- The estimated number of people 16 and over who are unemployed </w:t>
       </w:r>
     </w:p>
     <w:p>
@@ -533,10 +524,7 @@
         </w:numPr>
       </w:pPr>
       <w:r>
-        <w:t>S1701_C02_001E</w:t>
-      </w:r>
-      <w:r>
-        <w:t xml:space="preserve">- The estimated number of people who are below the poverty level </w:t>
+        <w:t xml:space="preserve">S1701_C02_001E- The estimated number of people who are below the poverty level </w:t>
       </w:r>
     </w:p>
     <w:p>
@@ -549,10 +537,7 @@
       </w:pPr>
       <w:r>
         <w:lastRenderedPageBreak/>
-        <w:t>S1701_C03_001E</w:t>
-      </w:r>
-      <w:r>
-        <w:t xml:space="preserve">- The estimated percentage of people who are below the poverty level </w:t>
+        <w:t xml:space="preserve">S1701_C03_001E- The estimated percentage of people who are below the poverty level </w:t>
       </w:r>
     </w:p>
     <w:p>
@@ -578,6 +563,29 @@
     </w:p>
     <w:p>
       <w:pPr>
+        <w:pStyle w:val="ListParagraph"/>
+        <w:numPr>
+          <w:ilvl w:val="0"/>
+          <w:numId w:val="4"/>
+        </w:numPr>
+      </w:pPr>
+      <w:r>
+        <w:t>S1701_C01_022E</w:t>
+      </w:r>
+      <w:r>
+        <w:t xml:space="preserve">- The estimated number of people 25 and </w:t>
+      </w:r>
+      <w:r>
+        <w:t xml:space="preserve">older </w:t>
+      </w:r>
+    </w:p>
+    <w:p>
+      <w:pPr>
+        <w:pStyle w:val="ListParagraph"/>
+      </w:pPr>
+    </w:p>
+    <w:p>
+      <w:pPr>
         <w:pStyle w:val="Heading3"/>
       </w:pPr>
       <w:r>
@@ -730,7 +738,11 @@
         <w:t xml:space="preserve"> understand and reference</w:t>
       </w:r>
       <w:r>
-        <w:t>. The county column in the Census table included the county name and the state, separated by a comma. I split this string in two using the comma as the delimi</w:t>
+        <w:t xml:space="preserve">. The county column in the Census table included the county name and the state, separated by a comma. I split this string in two using the comma as </w:t>
+      </w:r>
+      <w:r>
+        <w:lastRenderedPageBreak/>
+        <w:t>the delimi</w:t>
       </w:r>
       <w:r>
         <w:t>ter</w:t>
@@ -745,96 +757,776 @@
         <w:t xml:space="preserve"> Washington, as it was not needed. </w:t>
       </w:r>
       <w:r>
-        <w:t xml:space="preserve">I also ensure that the geo code in the Census table matches the geoid format in the crosswalk. To do this, I stripped </w:t>
+        <w:t xml:space="preserve">I also ensure that the geo code in the Census table matches the geoid format in the crosswalk. To do this, I stripped the first 5 characters from the geoid. This was </w:t>
+      </w:r>
+      <w:r>
+        <w:t>needed because the first 5 characters of the geoid pointed to Washington, so it was the same for all geoids in the table, which was redundant, and it could match the HUD data</w:t>
+      </w:r>
+      <w:r>
+        <w:t xml:space="preserve">. </w:t>
+      </w:r>
+    </w:p>
+    <w:p>
+      <w:r>
+        <w:t xml:space="preserve">For the </w:t>
+      </w:r>
+      <w:r>
+        <w:t>IRS</w:t>
+      </w:r>
+      <w:r>
+        <w:t xml:space="preserve"> table, I began by making sure that </w:t>
+      </w:r>
+      <w:r>
+        <w:t xml:space="preserve">the Zip </w:t>
+      </w:r>
+      <w:r>
+        <w:t xml:space="preserve">code in this table matched the </w:t>
+      </w:r>
+      <w:r>
+        <w:t xml:space="preserve">zip code </w:t>
+      </w:r>
+      <w:r>
+        <w:t xml:space="preserve">format in the crosswalk. </w:t>
+      </w:r>
+      <w:r>
+        <w:t xml:space="preserve">This was accomplished by removing </w:t>
+      </w:r>
+      <w:r>
+        <w:t xml:space="preserve">the ZIP+4 portion of the </w:t>
+      </w:r>
+      <w:r>
+        <w:t>ZIP code, changing it from a Zip+4 to a 5-digit ZIP</w:t>
+      </w:r>
+      <w:r>
+        <w:t xml:space="preserve"> code. </w:t>
+      </w:r>
+    </w:p>
+    <w:p>
+      <w:r>
+        <w:t xml:space="preserve">The cleaning of the HUD crosswalk data was minimal and ensured that the formatting and names of the zip and geoid were consistent across data sets. For the </w:t>
+      </w:r>
+      <w:r>
+        <w:t>Z</w:t>
+      </w:r>
+      <w:r>
+        <w:t>ip code</w:t>
+      </w:r>
+      <w:r>
+        <w:t xml:space="preserve">, I ensured that it was a 5-digit zip code with no extra </w:t>
+      </w:r>
+      <w:proofErr w:type="gramStart"/>
+      <w:r>
+        <w:t>spaces</w:t>
+      </w:r>
+      <w:proofErr w:type="gramEnd"/>
+      <w:r>
+        <w:t>. I also renamed the geoid column to “</w:t>
+      </w:r>
+      <w:proofErr w:type="spellStart"/>
+      <w:r>
+        <w:t>County_ID</w:t>
+      </w:r>
+      <w:proofErr w:type="spellEnd"/>
+      <w:r>
+        <w:t xml:space="preserve">” and set it to a 5-character </w:t>
+      </w:r>
+      <w:r>
+        <w:t>format</w:t>
+      </w:r>
+      <w:r>
+        <w:t xml:space="preserve">, removing any extra spaces to facilitate easy, reliable dataset integration.  </w:t>
+      </w:r>
+    </w:p>
+    <w:p>
+      <w:pPr>
+        <w:pStyle w:val="Heading3"/>
+      </w:pPr>
+      <w:r>
+        <w:t xml:space="preserve">Data Integration </w:t>
+      </w:r>
+    </w:p>
+    <w:p>
+      <w:r>
+        <w:t>To</w:t>
+      </w:r>
+      <w:r>
+        <w:t xml:space="preserve"> compare the needs data with the nonprofit support data, we needed to combine our data sets. I began this process by combining the HUD crosswalk with IRS data. This needed to be done before we combine</w:t>
+      </w:r>
+      <w:r>
+        <w:t>d</w:t>
+      </w:r>
+      <w:r>
+        <w:t xml:space="preserve"> </w:t>
+      </w:r>
+      <w:r>
+        <w:t>it with the Census data, so I could aggregate it</w:t>
+      </w:r>
+      <w:r>
+        <w:t xml:space="preserve"> to the county level to match the Census data. Once the HUD crosswalk and IRS data sets were combined, </w:t>
+      </w:r>
+      <w:r>
+        <w:t>two zip code columns were created, and the duplicate column was removed</w:t>
+      </w:r>
+      <w:r>
+        <w:t xml:space="preserve">. I then </w:t>
+      </w:r>
+      <w:r>
+        <w:t>ensured</w:t>
+      </w:r>
+      <w:r>
+        <w:t xml:space="preserve"> the table was at the county level by grouping the data by county</w:t>
+      </w:r>
+      <w:r>
+        <w:t xml:space="preserve">. </w:t>
+      </w:r>
+      <w:r>
+        <w:t>After the HUD and IRS data were aggregated to the county level, I combined the resulting table with the Census data.</w:t>
+      </w:r>
+    </w:p>
+    <w:p>
+      <w:pPr>
+        <w:pStyle w:val="Heading3"/>
+      </w:pPr>
+      <w:r>
+        <w:t xml:space="preserve">Feature Engineering </w:t>
+      </w:r>
+    </w:p>
+    <w:p>
+      <w:r>
+        <w:t xml:space="preserve">For easier comparison of the </w:t>
+      </w:r>
+      <w:r>
+        <w:t xml:space="preserve">needs data and nonprofit support data, </w:t>
+      </w:r>
+      <w:r>
+        <w:t xml:space="preserve">derived variables were created and added to the </w:t>
+      </w:r>
+      <w:r>
+        <w:t>clean</w:t>
+      </w:r>
+      <w:r>
+        <w:t xml:space="preserve"> and combined dataset. I created Non_profits_per_1000. This derived variable was created by dividing the </w:t>
+      </w:r>
+      <w:proofErr w:type="spellStart"/>
+      <w:r>
+        <w:t>Nonprofit_count</w:t>
+      </w:r>
+      <w:proofErr w:type="spellEnd"/>
+      <w:r>
+        <w:t xml:space="preserve"> by the </w:t>
+      </w:r>
+      <w:proofErr w:type="spellStart"/>
+      <w:r>
+        <w:t>Total_population</w:t>
+      </w:r>
+      <w:proofErr w:type="spellEnd"/>
+      <w:r>
+        <w:t xml:space="preserve"> and multiplying by 1,000. This tells us, for every 1,000 people estimated in the county, how many nonprofits there are to support them. It also allows us to compare the number of nonprofits in a county while </w:t>
+      </w:r>
+      <w:proofErr w:type="gramStart"/>
+      <w:r>
+        <w:t xml:space="preserve">taking into </w:t>
+      </w:r>
+      <w:r>
+        <w:t>account</w:t>
+      </w:r>
+      <w:proofErr w:type="gramEnd"/>
+      <w:r>
+        <w:t xml:space="preserve"> differences in the county's population</w:t>
+      </w:r>
+      <w:r>
+        <w:t xml:space="preserve">. Additionally, I created </w:t>
+      </w:r>
+      <w:proofErr w:type="spellStart"/>
+      <w:r>
+        <w:t>People_Per_Nonprofit</w:t>
+      </w:r>
+      <w:proofErr w:type="spellEnd"/>
+      <w:r>
+        <w:t>, giving us an estimated population-to-nonprofit ratio</w:t>
+      </w:r>
+      <w:r>
+        <w:t>. A higher number of people per nonprofit indicates relatively fewer nonprofit organizations available to serve the county’s population.</w:t>
+      </w:r>
+    </w:p>
+    <w:p>
+      <w:r>
+        <w:t xml:space="preserve">Additional derived variables were added later in the project to support the ML model, including </w:t>
+      </w:r>
+      <w:proofErr w:type="spellStart"/>
+      <w:r>
+        <w:t>U</w:t>
+      </w:r>
+      <w:r>
+        <w:t>nemployment_percent</w:t>
+      </w:r>
+      <w:proofErr w:type="spellEnd"/>
+      <w:r>
+        <w:t xml:space="preserve"> and </w:t>
+      </w:r>
+      <w:proofErr w:type="spellStart"/>
+      <w:r>
+        <w:t>did_not_graduate_percent</w:t>
+      </w:r>
+      <w:proofErr w:type="spellEnd"/>
+      <w:r>
+        <w:t xml:space="preserve">. The </w:t>
+      </w:r>
+      <w:proofErr w:type="spellStart"/>
+      <w:r>
+        <w:t>unemployment_percent</w:t>
+      </w:r>
+      <w:proofErr w:type="spellEnd"/>
+      <w:r>
+        <w:t xml:space="preserve"> was created by dividing the </w:t>
+      </w:r>
+      <w:r>
+        <w:t>number</w:t>
+      </w:r>
+      <w:r>
+        <w:t xml:space="preserve"> of unemployed individuals</w:t>
+      </w:r>
+      <w:r>
+        <w:t xml:space="preserve"> by </w:t>
       </w:r>
       <w:r>
         <w:lastRenderedPageBreak/>
-        <w:t xml:space="preserve">the first 5 characters from the geoid. This was </w:t>
-      </w:r>
-      <w:r>
-        <w:t>needed because the first 5 characters of the geoid pointed to Washington, so it was the same for all geoids in the table, which was redundant, and it could match the HUD data</w:t>
-      </w:r>
+        <w:t xml:space="preserve">the </w:t>
+      </w:r>
+      <w:proofErr w:type="spellStart"/>
+      <w:r>
+        <w:t>Total_Labor_Force</w:t>
+      </w:r>
+      <w:proofErr w:type="spellEnd"/>
+      <w:r>
+        <w:t xml:space="preserve"> and multiplying by 100. </w:t>
+      </w:r>
+      <w:r>
+        <w:t>This provides the estimated percentage of the labor force that is unemployed</w:t>
+      </w:r>
+      <w:r>
+        <w:t xml:space="preserve">. The </w:t>
+      </w:r>
+      <w:proofErr w:type="spellStart"/>
+      <w:r>
+        <w:t>did_not_graduate_percent</w:t>
+      </w:r>
+      <w:proofErr w:type="spellEnd"/>
+      <w:r>
+        <w:t xml:space="preserve"> was calculated by dividing </w:t>
+      </w:r>
+      <w:proofErr w:type="spellStart"/>
+      <w:r>
+        <w:t>Less_Than_High_School</w:t>
+      </w:r>
+      <w:proofErr w:type="spellEnd"/>
+      <w:r>
+        <w:t xml:space="preserve"> by </w:t>
+      </w:r>
+      <w:r>
+        <w:t>Pop_25_</w:t>
+      </w:r>
+      <w:r>
+        <w:t>and_Up</w:t>
+      </w:r>
+      <w:r>
+        <w:t xml:space="preserve">, then multiplying by 100. This is important because it </w:t>
+      </w:r>
+      <w:r>
+        <w:t>provides the estimated percentage of adults aged 25 and older</w:t>
+      </w:r>
+      <w:r>
+        <w:t xml:space="preserve"> in each county who did not graduate from high school.  </w:t>
+      </w:r>
+    </w:p>
+    <w:p>
+      <w:r>
+        <w:t xml:space="preserve">Lastly, to perform the final analysis and </w:t>
+      </w:r>
+      <w:r>
+        <w:t xml:space="preserve">create the final ranking, I needed to derive three additional variables: </w:t>
+      </w:r>
+      <w:proofErr w:type="spellStart"/>
+      <w:r>
+        <w:t>Needs_Score</w:t>
+      </w:r>
+      <w:proofErr w:type="spellEnd"/>
+      <w:r>
+        <w:t xml:space="preserve">, </w:t>
+      </w:r>
+      <w:proofErr w:type="spellStart"/>
+      <w:r>
+        <w:t>Support_Gap_Score</w:t>
+      </w:r>
+      <w:proofErr w:type="spellEnd"/>
+      <w:r>
+        <w:t xml:space="preserve">, and </w:t>
+      </w:r>
+      <w:proofErr w:type="spellStart"/>
+      <w:r>
+        <w:t>Final_Score</w:t>
+      </w:r>
+      <w:proofErr w:type="spellEnd"/>
+      <w:r>
+        <w:t xml:space="preserve">. The </w:t>
+      </w:r>
+      <w:proofErr w:type="spellStart"/>
+      <w:r>
+        <w:t>Needs_Score</w:t>
+      </w:r>
+      <w:proofErr w:type="spellEnd"/>
+      <w:r>
+        <w:t xml:space="preserve"> was calculated as the average of variables identified as contributing to the county's needs, including Poverty_percent, </w:t>
+      </w:r>
+      <w:proofErr w:type="spellStart"/>
+      <w:r>
+        <w:t>Unemployed_Percent</w:t>
+      </w:r>
+      <w:proofErr w:type="spellEnd"/>
+      <w:r>
+        <w:t xml:space="preserve">, and </w:t>
+      </w:r>
+      <w:proofErr w:type="spellStart"/>
+      <w:r>
+        <w:t>Did_Not_Graduate_Percent</w:t>
+      </w:r>
+      <w:proofErr w:type="spellEnd"/>
       <w:r>
         <w:t xml:space="preserve">. </w:t>
       </w:r>
-    </w:p>
-    <w:p>
-      <w:r>
-        <w:t xml:space="preserve">For the </w:t>
-      </w:r>
-      <w:r>
-        <w:t>IRS</w:t>
-      </w:r>
-      <w:r>
-        <w:t xml:space="preserve"> table, I began by making sure that </w:t>
-      </w:r>
-      <w:r>
-        <w:t xml:space="preserve">the Zip </w:t>
-      </w:r>
-      <w:r>
-        <w:t xml:space="preserve">code in this table matched the </w:t>
-      </w:r>
-      <w:r>
-        <w:t xml:space="preserve">zip code </w:t>
-      </w:r>
-      <w:r>
-        <w:t xml:space="preserve">format in the crosswalk. </w:t>
-      </w:r>
-      <w:r>
-        <w:t xml:space="preserve">This was accomplished by removing </w:t>
-      </w:r>
-      <w:r>
-        <w:t xml:space="preserve">the ZIP+4 portion of the </w:t>
-      </w:r>
-      <w:r>
-        <w:t>ZIP code, changing it from a Zip+4 to a 5-digit ZIP</w:t>
-      </w:r>
-      <w:r>
-        <w:t xml:space="preserve"> code. </w:t>
-      </w:r>
-    </w:p>
-    <w:p>
-      <w:r>
-        <w:t xml:space="preserve">The cleaning of the HUD crosswalk data was minimal and ensured that the formatting and names of the zip and geoid were consistent across data sets. For the </w:t>
-      </w:r>
-      <w:r>
-        <w:t>Z</w:t>
-      </w:r>
-      <w:r>
-        <w:t>ip code</w:t>
-      </w:r>
-      <w:r>
-        <w:t xml:space="preserve">, I ensured that it was a 5-digit zip code with no extra </w:t>
+      <w:r>
+        <w:t xml:space="preserve">All three </w:t>
+      </w:r>
+      <w:r>
+        <w:t xml:space="preserve">were standardized before being used to calculate the </w:t>
+      </w:r>
+      <w:proofErr w:type="spellStart"/>
+      <w:r>
+        <w:t>Needs_Score</w:t>
+      </w:r>
+      <w:proofErr w:type="spellEnd"/>
+      <w:r>
+        <w:t xml:space="preserve">. </w:t>
+      </w:r>
+      <w:r>
+        <w:t xml:space="preserve">This allowed us to assign a score to counties based on the combined variables to estimate each county's need. The </w:t>
+      </w:r>
+      <w:proofErr w:type="spellStart"/>
+      <w:r>
+        <w:t>Support</w:t>
+      </w:r>
+      <w:r>
+        <w:t>_Gap_Score</w:t>
+      </w:r>
+      <w:proofErr w:type="spellEnd"/>
+      <w:r>
+        <w:t xml:space="preserve"> was created using </w:t>
       </w:r>
       <w:proofErr w:type="gramStart"/>
       <w:r>
-        <w:t>spaces</w:t>
+        <w:t xml:space="preserve">the </w:t>
+      </w:r>
+      <w:proofErr w:type="spellStart"/>
+      <w:r>
+        <w:t>People</w:t>
       </w:r>
       <w:proofErr w:type="gramEnd"/>
       <w:r>
-        <w:t>. I also renamed the geoid column to “</w:t>
+        <w:t>_Per_Nonprofit</w:t>
+      </w:r>
+      <w:proofErr w:type="spellEnd"/>
+      <w:r>
+        <w:t xml:space="preserve"> and scaling. This gives us a way to compare the number of nonprofits in each county while accounting for county size. Finally, I created the </w:t>
       </w:r>
       <w:proofErr w:type="spellStart"/>
       <w:r>
+        <w:t>Final_Score</w:t>
+      </w:r>
+      <w:proofErr w:type="spellEnd"/>
+      <w:r>
+        <w:t xml:space="preserve"> to rank the counties based on their estimated needs and lack of nonprofit support. The </w:t>
+      </w:r>
+      <w:proofErr w:type="spellStart"/>
+      <w:r>
+        <w:t>Final_Score</w:t>
+      </w:r>
+      <w:proofErr w:type="spellEnd"/>
+      <w:r>
+        <w:t xml:space="preserve"> was calculated by </w:t>
+      </w:r>
+      <w:r>
+        <w:t xml:space="preserve">adding together the </w:t>
+      </w:r>
+      <w:proofErr w:type="spellStart"/>
+      <w:r>
+        <w:t>Support_Gap_Score</w:t>
+      </w:r>
+      <w:proofErr w:type="spellEnd"/>
+      <w:r>
+        <w:t xml:space="preserve"> and the </w:t>
+      </w:r>
+      <w:proofErr w:type="spellStart"/>
+      <w:r>
+        <w:t>Needs_Score</w:t>
+      </w:r>
+      <w:proofErr w:type="spellEnd"/>
+      <w:r>
+        <w:t xml:space="preserve">. Both were given </w:t>
+      </w:r>
+      <w:proofErr w:type="gramStart"/>
+      <w:r>
+        <w:t>a 50</w:t>
+      </w:r>
+      <w:proofErr w:type="gramEnd"/>
+      <w:r>
+        <w:t xml:space="preserve">% weight, so </w:t>
+      </w:r>
+      <w:r>
+        <w:t xml:space="preserve">they contributed equally to the ranking of the counties. </w:t>
+      </w:r>
+    </w:p>
+    <w:p>
+      <m:oMathPara>
+        <m:oMath>
+          <m:r>
+            <w:rPr>
+              <w:rFonts w:ascii="Cambria Math" w:hAnsi="Cambria Math"/>
+            </w:rPr>
+            <m:t>Final</m:t>
+          </m:r>
+          <m:r>
+            <w:rPr>
+              <w:rFonts w:ascii="Cambria Math" w:hAnsi="Cambria Math"/>
+            </w:rPr>
+            <m:t>_S</m:t>
+          </m:r>
+          <m:r>
+            <w:rPr>
+              <w:rFonts w:ascii="Cambria Math" w:hAnsi="Cambria Math"/>
+            </w:rPr>
+            <m:t>core=</m:t>
+          </m:r>
+          <m:d>
+            <m:dPr>
+              <m:ctrlPr>
+                <w:rPr>
+                  <w:rFonts w:ascii="Cambria Math" w:hAnsi="Cambria Math"/>
+                  <w:i/>
+                </w:rPr>
+              </m:ctrlPr>
+            </m:dPr>
+            <m:e>
+              <m:r>
+                <w:rPr>
+                  <w:rFonts w:ascii="Cambria Math" w:hAnsi="Cambria Math"/>
+                </w:rPr>
+                <m:t>Needs_Score×0.50</m:t>
+              </m:r>
+            </m:e>
+          </m:d>
+          <m:r>
+            <w:rPr>
+              <w:rFonts w:ascii="Cambria Math" w:hAnsi="Cambria Math"/>
+            </w:rPr>
+            <m:t>+(Support_Gap_Score×0.50)</m:t>
+          </m:r>
+        </m:oMath>
+      </m:oMathPara>
+    </w:p>
+    <w:p>
+      <w:pPr>
+        <w:pStyle w:val="Heading3"/>
+      </w:pPr>
+      <w:r>
+        <w:t xml:space="preserve">Final Dataset </w:t>
+      </w:r>
+    </w:p>
+    <w:p>
+      <w:r>
+        <w:t xml:space="preserve">After cleaning, joining, and feature engineering, the datasets </w:t>
+      </w:r>
+      <w:r>
+        <w:t>were</w:t>
+      </w:r>
+      <w:r>
+        <w:t xml:space="preserve"> combined into the final </w:t>
+      </w:r>
+      <w:r>
+        <w:t xml:space="preserve">county-level analytical data set. </w:t>
+      </w:r>
+      <w:r>
+        <w:t xml:space="preserve">The </w:t>
+      </w:r>
+      <w:proofErr w:type="spellStart"/>
+      <w:r>
+        <w:t>final_county_analysis</w:t>
+      </w:r>
+      <w:proofErr w:type="spellEnd"/>
+      <w:r>
+        <w:t xml:space="preserve"> contains one row per County in Washington state. In total, our final dataset ended with 39 rows. </w:t>
+      </w:r>
+      <w:r>
+        <w:t xml:space="preserve"> </w:t>
+      </w:r>
+      <w:r>
+        <w:t xml:space="preserve">The dataset contains </w:t>
+      </w:r>
+      <w:r>
+        <w:t>County identifiers</w:t>
+      </w:r>
+      <w:r>
+        <w:t xml:space="preserve">, including </w:t>
+      </w:r>
+      <w:proofErr w:type="spellStart"/>
+      <w:r>
         <w:t>County_ID</w:t>
       </w:r>
       <w:proofErr w:type="spellEnd"/>
       <w:r>
-        <w:t xml:space="preserve">” and set it to a 5-character </w:t>
-      </w:r>
-      <w:r>
-        <w:t>format</w:t>
-      </w:r>
-      <w:r>
-        <w:t xml:space="preserve">, removing any extra spaces to facilitate easy, reliable dataset integration.  </w:t>
-      </w:r>
-    </w:p>
-    <w:p>
-      <w:pPr>
-        <w:pStyle w:val="Heading3"/>
-      </w:pPr>
-      <w:r>
-        <w:t xml:space="preserve">Data Integration </w:t>
+        <w:t xml:space="preserve"> and Count</w:t>
+      </w:r>
+      <w:r>
+        <w:t>y</w:t>
+      </w:r>
+      <w:r>
+        <w:t>. It also inclu</w:t>
+      </w:r>
+      <w:r>
+        <w:t xml:space="preserve">des population </w:t>
+      </w:r>
+      <w:r>
+        <w:t>and</w:t>
+      </w:r>
+      <w:r>
+        <w:t xml:space="preserve"> needs information: </w:t>
+      </w:r>
+      <w:proofErr w:type="spellStart"/>
+      <w:r>
+        <w:t>Total_Population</w:t>
+      </w:r>
+      <w:proofErr w:type="spellEnd"/>
+      <w:r>
+        <w:t xml:space="preserve">, Poverty_Percent, Unemployed, </w:t>
+      </w:r>
+      <w:proofErr w:type="spellStart"/>
+      <w:proofErr w:type="gramStart"/>
+      <w:r>
+        <w:t>Less</w:t>
+      </w:r>
+      <w:proofErr w:type="gramEnd"/>
+      <w:r>
+        <w:t>_Than_High_School</w:t>
+      </w:r>
+      <w:proofErr w:type="spellEnd"/>
+      <w:r>
+        <w:t xml:space="preserve">, </w:t>
+      </w:r>
+      <w:proofErr w:type="spellStart"/>
+      <w:r>
+        <w:t>Unemployment_percent</w:t>
+      </w:r>
+      <w:proofErr w:type="spellEnd"/>
+      <w:r>
+        <w:t>, Pop_25_and_Up</w:t>
+      </w:r>
+      <w:r>
+        <w:t xml:space="preserve">, </w:t>
+      </w:r>
+      <w:r>
+        <w:t xml:space="preserve">and </w:t>
+      </w:r>
+      <w:proofErr w:type="spellStart"/>
+      <w:r>
+        <w:t>Did_Not_G</w:t>
+      </w:r>
+      <w:r>
+        <w:t>raduate_percent</w:t>
+      </w:r>
+      <w:proofErr w:type="spellEnd"/>
+      <w:r>
+        <w:t xml:space="preserve">. </w:t>
+      </w:r>
+      <w:r>
+        <w:t xml:space="preserve">Finally, we have the </w:t>
+      </w:r>
+      <w:r>
+        <w:t xml:space="preserve">model and final analysis </w:t>
+      </w:r>
+      <w:r>
+        <w:t>variables</w:t>
+      </w:r>
+      <w:r>
+        <w:t xml:space="preserve">: </w:t>
+      </w:r>
+      <w:proofErr w:type="spellStart"/>
+      <w:r>
+        <w:t>Needs_Score</w:t>
+      </w:r>
+      <w:proofErr w:type="spellEnd"/>
+      <w:r>
+        <w:t xml:space="preserve">, </w:t>
+      </w:r>
+      <w:proofErr w:type="spellStart"/>
+      <w:r>
+        <w:t>Support_Gap_Score</w:t>
+      </w:r>
+      <w:proofErr w:type="spellEnd"/>
+      <w:r>
+        <w:t xml:space="preserve">, and </w:t>
+      </w:r>
+      <w:proofErr w:type="spellStart"/>
+      <w:r>
+        <w:t>Final_Score</w:t>
+      </w:r>
+      <w:proofErr w:type="spellEnd"/>
+      <w:r>
+        <w:t xml:space="preserve">. </w:t>
+      </w:r>
+    </w:p>
+    <w:p>
+      <w:r>
+        <w:t xml:space="preserve">The final dataset was created and used to support the </w:t>
+      </w:r>
+      <w:r>
+        <w:t>project's final analysis</w:t>
+      </w:r>
+      <w:r>
+        <w:t xml:space="preserve">. </w:t>
+      </w:r>
+      <w:r>
+        <w:t>The dataset allowed</w:t>
+      </w:r>
+      <w:r>
+        <w:t xml:space="preserve"> us to compare </w:t>
+      </w:r>
+      <w:r>
+        <w:t xml:space="preserve">community need indicators across counties, compare nonprofit availability relative to population, perform k-means clustering, rank counties, and create Tableau visualizations. </w:t>
+      </w:r>
+    </w:p>
+    <w:p>
+      <w:r>
+        <w:t xml:space="preserve">The final dataset passed the </w:t>
+      </w:r>
+      <w:r>
+        <w:t>project's</w:t>
+      </w:r>
+      <w:r>
+        <w:t xml:space="preserve"> defined validation tests, including checks for expected columns, missing values, score calculations, and valid score ranges. These </w:t>
+      </w:r>
+      <w:r>
+        <w:lastRenderedPageBreak/>
+        <w:t>checks confirmed that the data set met the expected structural and calculation requirements for analysis.</w:t>
+      </w:r>
+    </w:p>
+    <w:p>
+      <w:pPr>
+        <w:pStyle w:val="Heading2"/>
+      </w:pPr>
+      <w:r>
+        <w:t xml:space="preserve">Modeling </w:t>
+      </w:r>
+    </w:p>
+    <w:p>
+      <w:r>
+        <w:t xml:space="preserve">For this project, an unsupervised K-means clustering algorithm </w:t>
+      </w:r>
+      <w:r>
+        <w:t xml:space="preserve">was used. </w:t>
+      </w:r>
+      <w:r>
+        <w:t xml:space="preserve">This was the best choice to analyze the </w:t>
+      </w:r>
+      <w:r>
+        <w:t>counties in Washington because we did not have a target variable for the model</w:t>
+      </w:r>
+      <w:r>
+        <w:t xml:space="preserve"> to learn to predict</w:t>
+      </w:r>
+      <w:r>
+        <w:t>. Rather</w:t>
+      </w:r>
+      <w:r>
+        <w:t>,</w:t>
+      </w:r>
+      <w:r>
+        <w:t xml:space="preserve"> the selected features describe different aspects of community need</w:t>
+      </w:r>
+      <w:r>
+        <w:t xml:space="preserve">. These variables represent different dimensions of community need. </w:t>
+      </w:r>
+      <w:r>
+        <w:t>K-means examines</w:t>
+      </w:r>
+      <w:r>
+        <w:t xml:space="preserve"> </w:t>
+      </w:r>
+      <w:r>
+        <w:t>the</w:t>
+      </w:r>
+      <w:r>
+        <w:t xml:space="preserve"> </w:t>
+      </w:r>
+      <w:r>
+        <w:t>counties’</w:t>
+      </w:r>
+      <w:r>
+        <w:t xml:space="preserve"> values across these </w:t>
+      </w:r>
+      <w:r>
+        <w:t>variables</w:t>
+      </w:r>
+      <w:r>
+        <w:t xml:space="preserve"> and groups </w:t>
+      </w:r>
+      <w:r>
+        <w:t>them into clusters with</w:t>
+      </w:r>
+      <w:r>
+        <w:t xml:space="preserve"> similar overall profiles. </w:t>
+      </w:r>
+      <w:r>
+        <w:t xml:space="preserve">This gives us a way to characterize counties based on their similarity across multiple need indicators, rather </w:t>
+      </w:r>
+      <w:r>
+        <w:t>than</w:t>
+      </w:r>
+      <w:r>
+        <w:t xml:space="preserve"> </w:t>
+      </w:r>
+      <w:r>
+        <w:t xml:space="preserve">relying on a single variable. </w:t>
+      </w:r>
+    </w:p>
+    <w:p>
+      <w:r>
+        <w:t xml:space="preserve">Additionally, because we are looking at counties in Washington, our data set is </w:t>
+      </w:r>
+      <w:r>
+        <w:t>relatively small</w:t>
+      </w:r>
+      <w:r>
+        <w:t xml:space="preserve">. If we were to split the data </w:t>
+      </w:r>
+      <w:r>
+        <w:t xml:space="preserve">for a supervised model into train and test sets, both sets would be </w:t>
+      </w:r>
+      <w:r>
+        <w:t xml:space="preserve">relatively </w:t>
+      </w:r>
+      <w:r>
+        <w:t xml:space="preserve">small, </w:t>
+      </w:r>
+      <w:r>
+        <w:t xml:space="preserve">making model performance less reliable. Using the K-means model allows us to use the full set of </w:t>
+      </w:r>
+      <w:r>
+        <w:t>counties to identify patterns rather than</w:t>
+      </w:r>
+      <w:r>
+        <w:t xml:space="preserve"> splitting the 39 coun</w:t>
+      </w:r>
+      <w:r>
+        <w:t xml:space="preserve">ty observations. </w:t>
       </w:r>
     </w:p>
     <w:p>
@@ -842,325 +1534,241 @@
         <w:t>To</w:t>
       </w:r>
       <w:r>
-        <w:t xml:space="preserve"> compare the needs data with the nonprofit support data, we needed to combine our data sets. I began this process by combining the HUD crosswalk with IRS data. This needed to be done before we combine</w:t>
-      </w:r>
-      <w:r>
-        <w:t>d</w:t>
+        <w:t xml:space="preserve"> ensure that </w:t>
+      </w:r>
+      <w:r>
+        <w:t>poverty, unemployment</w:t>
+      </w:r>
+      <w:r>
+        <w:t>, and educational disadvantages can contribute fairly to the clustering process, the variables were</w:t>
+      </w:r>
+      <w:r>
+        <w:t xml:space="preserve"> standardized using a standard scaler. </w:t>
+      </w:r>
+      <w:r>
+        <w:t>K-</w:t>
+      </w:r>
+      <w:r>
+        <w:t>means is distance-based, and without scaling, a variable with a larger numerical range could have a greater</w:t>
+      </w:r>
+      <w:r>
+        <w:t xml:space="preserve"> influence on the clusters. </w:t>
+      </w:r>
+    </w:p>
+    <w:p>
+      <w:r>
+        <w:t>Before running the K-means model</w:t>
+      </w:r>
+      <w:r>
+        <w:t xml:space="preserve">, I determined the number of clusters that would give us the best results using silhouette testing. </w:t>
+      </w:r>
+      <w:r>
+        <w:t xml:space="preserve">I tested the </w:t>
+      </w:r>
+      <w:r>
+        <w:t>silhouette</w:t>
+      </w:r>
+      <w:r>
+        <w:t xml:space="preserve"> scores for clusters </w:t>
+      </w:r>
+      <w:r>
+        <w:t xml:space="preserve">2-6. </w:t>
+      </w:r>
+      <w:r>
+        <w:t>Based on the results</w:t>
+      </w:r>
+      <w:r>
+        <w:t xml:space="preserve">, a K-means model with 4 clusters </w:t>
+      </w:r>
+      <w:r>
+        <w:t>yields the best silhouette score of</w:t>
+      </w:r>
+      <w:r>
+        <w:t xml:space="preserve"> 0.388</w:t>
+      </w:r>
+      <w:r>
+        <w:t xml:space="preserve">. </w:t>
+      </w:r>
+    </w:p>
+    <w:p>
+      <w:r>
+        <w:t xml:space="preserve">The </w:t>
+      </w:r>
+      <w:r>
+        <w:t>model</w:t>
       </w:r>
       <w:r>
         <w:t xml:space="preserve"> </w:t>
       </w:r>
       <w:r>
-        <w:t>it with the Census data, so I could aggregate it</w:t>
-      </w:r>
-      <w:r>
-        <w:t xml:space="preserve"> to the county level to match the Census data. Once the HUD crosswalk and IRS data sets were combined, </w:t>
-      </w:r>
-      <w:r>
-        <w:t>two zip code columns were created, and the duplicate column was removed</w:t>
-      </w:r>
-      <w:r>
-        <w:t xml:space="preserve">. I then </w:t>
-      </w:r>
-      <w:r>
-        <w:t>ensured</w:t>
-      </w:r>
-      <w:r>
-        <w:t xml:space="preserve"> the table was at the county level by grouping the data by county</w:t>
-      </w:r>
-      <w:r>
-        <w:t xml:space="preserve">. </w:t>
-      </w:r>
-      <w:r>
-        <w:t>After the HUD and IRS data were aggregated to the county level, I combined the resulting table with the Census data.</w:t>
-      </w:r>
-    </w:p>
-    <w:p>
-      <w:pPr>
-        <w:pStyle w:val="Heading3"/>
-      </w:pPr>
-      <w:r>
-        <w:t xml:space="preserve">Feature Engineering </w:t>
-      </w:r>
-    </w:p>
-    <w:p>
-      <w:r>
-        <w:t xml:space="preserve">For easier comparison of the </w:t>
-      </w:r>
-      <w:r>
-        <w:t xml:space="preserve">needs data and nonprofit support data, </w:t>
-      </w:r>
-      <w:r>
-        <w:t xml:space="preserve">derived variables were created and added to the </w:t>
-      </w:r>
-      <w:r>
-        <w:t>clean</w:t>
-      </w:r>
-      <w:r>
-        <w:t xml:space="preserve"> and combined dataset. I created Non_profits_per_1000. This derived variable was created by dividing the </w:t>
-      </w:r>
-      <w:proofErr w:type="spellStart"/>
-      <w:r>
-        <w:t>Nonprofit_count</w:t>
-      </w:r>
-      <w:proofErr w:type="spellEnd"/>
-      <w:r>
-        <w:t xml:space="preserve"> by the </w:t>
-      </w:r>
-      <w:proofErr w:type="spellStart"/>
-      <w:r>
-        <w:t>Total_population</w:t>
-      </w:r>
-      <w:proofErr w:type="spellEnd"/>
-      <w:r>
-        <w:t xml:space="preserve"> and multiplying by 1,000. This tells us, for every 1,000 people estimated in the county, how many nonprofits there are to support them. It also allows us to compare the number of nonprofits in a county while </w:t>
-      </w:r>
-      <w:proofErr w:type="gramStart"/>
-      <w:r>
-        <w:t xml:space="preserve">taking into </w:t>
-      </w:r>
-      <w:r>
-        <w:t>account</w:t>
-      </w:r>
-      <w:proofErr w:type="gramEnd"/>
-      <w:r>
-        <w:t xml:space="preserve"> differences in the county's population</w:t>
-      </w:r>
-      <w:r>
-        <w:t xml:space="preserve">. Additionally, I created </w:t>
-      </w:r>
-      <w:proofErr w:type="spellStart"/>
-      <w:r>
-        <w:t>People_Per_Nonprofit</w:t>
-      </w:r>
-      <w:proofErr w:type="spellEnd"/>
-      <w:r>
-        <w:t xml:space="preserve"> to </w:t>
-      </w:r>
-      <w:r>
-        <w:t xml:space="preserve">estimate </w:t>
-      </w:r>
-      <w:r>
-        <w:t>the average number of people</w:t>
-      </w:r>
-      <w:r>
-        <w:t xml:space="preserve"> each nonprofit serves</w:t>
-      </w:r>
-      <w:r>
-        <w:t>. A higher number of people per nonprofit indicates relatively fewer nonprofit organizations available to serve the county’s population.</w:t>
-      </w:r>
-    </w:p>
-    <w:p>
-      <w:r>
-        <w:t xml:space="preserve">Additional derived variables were added later in the project to support the ML model, including </w:t>
-      </w:r>
-      <w:proofErr w:type="spellStart"/>
-      <w:r>
-        <w:t>unemployment_percent</w:t>
-      </w:r>
-      <w:proofErr w:type="spellEnd"/>
-      <w:r>
-        <w:t xml:space="preserve"> and </w:t>
-      </w:r>
-      <w:proofErr w:type="spellStart"/>
-      <w:r>
-        <w:t>did_not_graduate_percent</w:t>
-      </w:r>
-      <w:proofErr w:type="spellEnd"/>
-      <w:r>
-        <w:t xml:space="preserve">. The </w:t>
-      </w:r>
-      <w:proofErr w:type="spellStart"/>
-      <w:r>
-        <w:t>unemployment_percent</w:t>
-      </w:r>
-      <w:proofErr w:type="spellEnd"/>
-      <w:r>
-        <w:t xml:space="preserve"> was created by dividing the </w:t>
-      </w:r>
-      <w:r>
-        <w:t>number</w:t>
-      </w:r>
-      <w:r>
-        <w:t xml:space="preserve"> of unemployed individuals</w:t>
-      </w:r>
-      <w:r>
-        <w:t xml:space="preserve"> by the </w:t>
-      </w:r>
-      <w:proofErr w:type="spellStart"/>
-      <w:r>
-        <w:t>Total_Labor_Force</w:t>
-      </w:r>
-      <w:proofErr w:type="spellEnd"/>
-      <w:r>
-        <w:t xml:space="preserve"> and multiplying by 100. </w:t>
-      </w:r>
-      <w:r>
-        <w:t xml:space="preserve">This provides the estimated percentage of </w:t>
+        <w:t>was then run</w:t>
+      </w:r>
+      <w:r>
+        <w:t xml:space="preserve"> using 4 clusters and a </w:t>
+      </w:r>
+      <w:r>
+        <w:t>random state</w:t>
+      </w:r>
+      <w:r>
+        <w:t xml:space="preserve"> of 42. </w:t>
+      </w:r>
+      <w:r>
+        <w:t xml:space="preserve">After the </w:t>
+      </w:r>
+      <w:r>
+        <w:t xml:space="preserve">code ran, the results were </w:t>
+      </w:r>
+      <w:r>
+        <w:t>tracked. I then checked</w:t>
+      </w:r>
+      <w:r>
+        <w:t xml:space="preserve"> to make sure that the clustering was stable across the tested random states</w:t>
+      </w:r>
+      <w:r>
+        <w:t xml:space="preserve">. I </w:t>
+      </w:r>
+      <w:r>
+        <w:t>used</w:t>
+      </w:r>
+      <w:r>
+        <w:t xml:space="preserve"> 0, 10, 20, 30, and 42</w:t>
+      </w:r>
+      <w:r>
+        <w:t xml:space="preserve"> as seeds for testing the </w:t>
+      </w:r>
+      <w:r>
+        <w:t>stability of the random state</w:t>
+      </w:r>
+      <w:r>
+        <w:t xml:space="preserve">. I then compared </w:t>
+      </w:r>
+      <w:r>
+        <w:t xml:space="preserve">each run to the first </w:t>
+      </w:r>
+      <w:r>
+        <w:t>to check whether changing the random state affected</w:t>
+      </w:r>
+      <w:r>
+        <w:t xml:space="preserve"> the </w:t>
+      </w:r>
+      <w:r>
+        <w:t>model. All runs produced the same output</w:t>
+      </w:r>
+      <w:r>
+        <w:t>: an ARI of 1.000, confirming that changing the random state did not affect</w:t>
+      </w:r>
+      <w:r>
+        <w:t xml:space="preserve"> the clustering results. </w:t>
+      </w:r>
+    </w:p>
+    <w:p>
+      <w:r>
+        <w:t xml:space="preserve">The model produced four clusters </w:t>
+      </w:r>
+      <w:r>
+        <w:t xml:space="preserve">that we then evaluated and interpreted. </w:t>
+      </w:r>
+      <w:r>
+        <w:t>To interpret the results, we calculated the meaning of each variable within</w:t>
+      </w:r>
+      <w:r>
+        <w:t xml:space="preserve"> each cluster. </w:t>
+      </w:r>
+      <w:r>
+        <w:t xml:space="preserve">This gave us an idea of what characteristics the different counties in each cluster shared. </w:t>
+      </w:r>
+      <w:r>
+        <w:t>Cluster 0</w:t>
+      </w:r>
+      <w:r>
+        <w:t xml:space="preserve"> had </w:t>
+      </w:r>
+      <w:r>
+        <w:t xml:space="preserve">low </w:t>
+      </w:r>
+      <w:r>
+        <w:t>overall</w:t>
+      </w:r>
+      <w:r>
+        <w:t xml:space="preserve"> needs. These counties have </w:t>
+      </w:r>
+      <w:r>
+        <w:t xml:space="preserve">the lowest poverty and </w:t>
+      </w:r>
+      <w:r>
+        <w:t>the lowest percentage of adults who did not graduate from high school</w:t>
+      </w:r>
+      <w:r>
+        <w:t>. Unemployment was also low, but not the lowest</w:t>
+      </w:r>
+      <w:r>
+        <w:t xml:space="preserve"> of </w:t>
       </w:r>
       <w:r>
         <w:lastRenderedPageBreak/>
-        <w:t>the labor force that is unemployed</w:t>
-      </w:r>
-      <w:r>
-        <w:t xml:space="preserve">. The </w:t>
-      </w:r>
-      <w:proofErr w:type="spellStart"/>
-      <w:r>
-        <w:t>did_not_graduate_percent</w:t>
-      </w:r>
-      <w:proofErr w:type="spellEnd"/>
-      <w:r>
-        <w:t xml:space="preserve"> was calculated by dividing </w:t>
-      </w:r>
-      <w:proofErr w:type="spellStart"/>
-      <w:r>
-        <w:t>Less_Than_High_School</w:t>
-      </w:r>
-      <w:proofErr w:type="spellEnd"/>
-      <w:r>
-        <w:t xml:space="preserve"> by the estimated </w:t>
-      </w:r>
-      <w:r>
-        <w:t>population between 25 and 68</w:t>
-      </w:r>
-      <w:r>
-        <w:t xml:space="preserve">, then multiplying by 100. This is important because it </w:t>
-      </w:r>
-      <w:r>
-        <w:t>provides the estimated percentage of adults aged 25 and older</w:t>
-      </w:r>
-      <w:r>
-        <w:t xml:space="preserve"> in each county who did not graduate from high school.  </w:t>
-      </w:r>
-    </w:p>
-    <w:p>
-      <w:r>
-        <w:t xml:space="preserve">Lastly, to perform the final analysis and </w:t>
-      </w:r>
-      <w:r>
-        <w:t xml:space="preserve">create the final ranking, I needed to derive three additional variables: </w:t>
-      </w:r>
-      <w:proofErr w:type="spellStart"/>
-      <w:r>
-        <w:t>Needs_Score</w:t>
-      </w:r>
-      <w:proofErr w:type="spellEnd"/>
-      <w:r>
-        <w:t xml:space="preserve">, </w:t>
-      </w:r>
-      <w:proofErr w:type="spellStart"/>
-      <w:r>
-        <w:t>Support_Gap_Score</w:t>
-      </w:r>
-      <w:proofErr w:type="spellEnd"/>
-      <w:r>
-        <w:t xml:space="preserve">, and </w:t>
-      </w:r>
-      <w:proofErr w:type="spellStart"/>
-      <w:r>
-        <w:t>Final_Score</w:t>
-      </w:r>
-      <w:proofErr w:type="spellEnd"/>
-      <w:r>
-        <w:t xml:space="preserve">. The </w:t>
-      </w:r>
-      <w:proofErr w:type="spellStart"/>
-      <w:r>
-        <w:t>Needs_Score</w:t>
-      </w:r>
-      <w:proofErr w:type="spellEnd"/>
-      <w:r>
-        <w:t xml:space="preserve"> was calculated as the average of variables identified as contributing to the county's needs, including Poverty_percent, </w:t>
-      </w:r>
-      <w:proofErr w:type="spellStart"/>
-      <w:r>
-        <w:t>Unemployed_Percent</w:t>
-      </w:r>
-      <w:proofErr w:type="spellEnd"/>
-      <w:r>
-        <w:t xml:space="preserve">, and </w:t>
-      </w:r>
-      <w:proofErr w:type="spellStart"/>
-      <w:r>
-        <w:t>Did_Not_Graduate_Percent</w:t>
-      </w:r>
-      <w:proofErr w:type="spellEnd"/>
-      <w:r>
-        <w:t xml:space="preserve">. This allowed us to assign a score to counties based on the combined variables to estimate each county's need. The </w:t>
-      </w:r>
-      <w:proofErr w:type="spellStart"/>
-      <w:r>
-        <w:t>Support</w:t>
-      </w:r>
-      <w:r>
-        <w:t>_Gap_Score</w:t>
-      </w:r>
-      <w:proofErr w:type="spellEnd"/>
-      <w:r>
-        <w:t xml:space="preserve"> was created using </w:t>
-      </w:r>
-      <w:proofErr w:type="gramStart"/>
-      <w:r>
-        <w:t>the Non</w:t>
-      </w:r>
-      <w:proofErr w:type="gramEnd"/>
-      <w:r>
-        <w:t xml:space="preserve">_Profits_per_1000 and scaling to make it easier to use when calculating the final score. This gives us a way to compare the number of nonprofits in each county while accounting for county size. Finally, I created the </w:t>
-      </w:r>
-      <w:proofErr w:type="spellStart"/>
-      <w:r>
-        <w:t>Final_Score</w:t>
-      </w:r>
-      <w:proofErr w:type="spellEnd"/>
-      <w:r>
-        <w:t xml:space="preserve"> to rank the counties based on their estimated needs and lack of nonprofit support. The </w:t>
-      </w:r>
-      <w:proofErr w:type="spellStart"/>
-      <w:r>
-        <w:t>Final_Score</w:t>
-      </w:r>
-      <w:proofErr w:type="spellEnd"/>
-      <w:r>
-        <w:t xml:space="preserve"> was calculated by </w:t>
-      </w:r>
-      <w:r>
-        <w:t xml:space="preserve">adding together the </w:t>
-      </w:r>
-      <w:proofErr w:type="spellStart"/>
-      <w:r>
-        <w:t>Support_Gap_Score</w:t>
-      </w:r>
-      <w:proofErr w:type="spellEnd"/>
-      <w:r>
-        <w:t xml:space="preserve"> and the </w:t>
-      </w:r>
-      <w:proofErr w:type="spellStart"/>
-      <w:r>
-        <w:t>Needs_Score</w:t>
-      </w:r>
-      <w:proofErr w:type="spellEnd"/>
-      <w:r>
-        <w:t xml:space="preserve">. Both were given </w:t>
-      </w:r>
-      <w:proofErr w:type="gramStart"/>
-      <w:r>
-        <w:t>a 50</w:t>
-      </w:r>
-      <w:proofErr w:type="gramEnd"/>
-      <w:r>
-        <w:t xml:space="preserve">% weight so that they contributed equally to the ranking of the counties. </w:t>
-      </w:r>
-    </w:p>
-    <w:p>
-      <w:pPr>
-        <w:pStyle w:val="Heading3"/>
-      </w:pPr>
-      <w:r>
-        <w:t xml:space="preserve">Final Dataset </w:t>
-      </w:r>
-    </w:p>
-    <w:p/>
+        <w:t>the clusters</w:t>
+      </w:r>
+      <w:r>
+        <w:t xml:space="preserve">. Cluster </w:t>
+      </w:r>
+      <w:r>
+        <w:t>1</w:t>
+      </w:r>
+      <w:r>
+        <w:t xml:space="preserve"> had moderate poverty and educational disadvantages; however, </w:t>
+      </w:r>
+      <w:r>
+        <w:t xml:space="preserve">it </w:t>
+      </w:r>
+      <w:r>
+        <w:t xml:space="preserve">had the highest overall unemployment rate among the clusters. </w:t>
+      </w:r>
+      <w:r>
+        <w:t xml:space="preserve">Cluster 2 had moderate needs </w:t>
+      </w:r>
+      <w:r>
+        <w:t xml:space="preserve">very similar to cluster 1, but </w:t>
+      </w:r>
+      <w:r>
+        <w:t xml:space="preserve">a lower unemployment rate. Lastly, </w:t>
+      </w:r>
+      <w:r>
+        <w:t xml:space="preserve">cluster </w:t>
+      </w:r>
+      <w:r>
+        <w:t xml:space="preserve">3 had a </w:t>
+      </w:r>
+      <w:r>
+        <w:t>substantially</w:t>
+      </w:r>
+      <w:r>
+        <w:t xml:space="preserve"> higher poverty and educational disadvantage </w:t>
+      </w:r>
+      <w:r>
+        <w:t xml:space="preserve">that was twice that of the other clusters. </w:t>
+      </w:r>
+      <w:r>
+        <w:t xml:space="preserve">While poverty and educational </w:t>
+      </w:r>
+      <w:r>
+        <w:t>disadvantages</w:t>
+      </w:r>
+      <w:r>
+        <w:t xml:space="preserve"> </w:t>
+      </w:r>
+      <w:r>
+        <w:t xml:space="preserve">were notably higher than in the other clusters, it had the lowest unemployment rate. </w:t>
+      </w:r>
+      <w:r>
+        <w:t>The cluste</w:t>
+      </w:r>
+      <w:r>
+        <w:t>r analysis describes the need patterns</w:t>
+      </w:r>
+      <w:r>
+        <w:t xml:space="preserve"> among counties in Washington. </w:t>
+      </w:r>
+    </w:p>
     <w:p/>
     <w:sectPr>
       <w:pgSz w:w="12240" w:h="15840"/>
@@ -2669,6 +3277,35 @@
       <w:spacing w:val="5"/>
     </w:rPr>
   </w:style>
+  <w:style w:type="character" w:styleId="PlaceholderText">
+    <w:name w:val="Placeholder Text"/>
+    <w:basedOn w:val="DefaultParagraphFont"/>
+    <w:uiPriority w:val="99"/>
+    <w:semiHidden/>
+    <w:rsid w:val="00CE1611"/>
+    <w:rPr>
+      <w:color w:val="666666"/>
+    </w:rPr>
+  </w:style>
+  <w:style w:type="table" w:styleId="TableGrid">
+    <w:name w:val="Table Grid"/>
+    <w:basedOn w:val="TableNormal"/>
+    <w:uiPriority w:val="39"/>
+    <w:rsid w:val="007174FE"/>
+    <w:pPr>
+      <w:spacing w:after="0" w:line="240" w:lineRule="auto"/>
+    </w:pPr>
+    <w:tblPr>
+      <w:tblBorders>
+        <w:top w:val="single" w:sz="4" w:space="0" w:color="auto"/>
+        <w:left w:val="single" w:sz="4" w:space="0" w:color="auto"/>
+        <w:bottom w:val="single" w:sz="4" w:space="0" w:color="auto"/>
+        <w:right w:val="single" w:sz="4" w:space="0" w:color="auto"/>
+        <w:insideH w:val="single" w:sz="4" w:space="0" w:color="auto"/>
+        <w:insideV w:val="single" w:sz="4" w:space="0" w:color="auto"/>
+      </w:tblBorders>
+    </w:tblPr>
+  </w:style>
 </w:styles>
 </file>
 

</xml_diff>